<commit_message>
Update AquiferOpenStudyNotesProfiles for 2026-07-14 release
</commit_message>
<xml_diff>
--- a/arb/docx/001.content.docx
+++ b/arb/docx/001.content.docx
@@ -22,7 +22,7 @@
         <w:rPr>
           <w:lang w:val="ar_AE" w:bidi="ar_AE"/>
         </w:rPr>
-        <w:t>Resource: Tyndale Open Study Notes</w:t>
+        <w:t>Resource: Aquifer Open Study Notes (Profiles)</w:t>
       </w:r>
       <w:r>
         <w:rPr>
@@ -122,7 +122,7 @@
         <w:rPr>
           <w:lang w:val="ar_AE" w:bidi="ar_AE"/>
         </w:rPr>
-        <w:t>Tyndale Open Study Notes</w:t>
+        <w:t>Aquifer Open Study Notes (Profiles)</w:t>
       </w:r>
     </w:p>
     <w:p>

</xml_diff>